<commit_message>
feat: rediseño ICC segun foto, alertas de 10 dias y bloqueo de pagos por ICC vencido
</commit_message>
<xml_diff>
--- a/Initial Certiification.docx
+++ b/Initial Certiification.docx
@@ -13,7 +13,74 @@
       <w:proofErr w:type="spellEnd"/>
     </w:p>
     <w:p/>
-    <w:p/>
+    <w:p>
+      <w:pPr>
+        <w:rPr>
+          <w:lang w:val="es-419"/>
+        </w:rPr>
+      </w:pPr>
+      <w:r>
+        <w:rPr>
+          <w:lang w:val="es-419"/>
+        </w:rPr>
+        <w:t xml:space="preserve">Hacer una </w:t>
+      </w:r>
+      <w:proofErr w:type="spellStart"/>
+      <w:r>
+        <w:rPr>
+          <w:lang w:val="es-419"/>
+        </w:rPr>
+        <w:t>seccion</w:t>
+      </w:r>
+      <w:proofErr w:type="spellEnd"/>
+      <w:r>
+        <w:rPr>
+          <w:lang w:val="es-419"/>
+        </w:rPr>
+        <w:t xml:space="preserve"> que e</w:t>
+      </w:r>
+      <w:r>
+        <w:rPr>
+          <w:lang w:val="es-419"/>
+        </w:rPr>
+        <w:t xml:space="preserve">l botón se localice entre Certificados de manufactura y minutas, en ocasiones el contratista entrega unos </w:t>
+      </w:r>
+      <w:proofErr w:type="spellStart"/>
+      <w:r>
+        <w:rPr>
+          <w:lang w:val="es-419"/>
+        </w:rPr>
+        <w:t>initial</w:t>
+      </w:r>
+      <w:proofErr w:type="spellEnd"/>
+      <w:r>
+        <w:rPr>
+          <w:lang w:val="es-419"/>
+        </w:rPr>
+        <w:t xml:space="preserve"> </w:t>
+      </w:r>
+      <w:proofErr w:type="spellStart"/>
+      <w:r>
+        <w:rPr>
+          <w:lang w:val="es-419"/>
+        </w:rPr>
+        <w:t>certification</w:t>
+      </w:r>
+      <w:proofErr w:type="spellEnd"/>
+      <w:r>
+        <w:rPr>
+          <w:lang w:val="es-419"/>
+        </w:rPr>
+        <w:t>, que deben estar notarizados</w:t>
+      </w:r>
+    </w:p>
+    <w:p>
+      <w:pPr>
+        <w:rPr>
+          <w:lang w:val="es-419"/>
+        </w:rPr>
+      </w:pPr>
+    </w:p>
     <w:sectPr>
       <w:pgSz w:w="12240" w:h="15840"/>
       <w:pgMar w:top="1440" w:right="1440" w:bottom="1440" w:left="1440" w:header="720" w:footer="720" w:gutter="0"/>

</xml_diff>